<commit_message>
Update LoI and email: JVTP as formal applicant, Make More as implementation partner
Clarify grant structure in both the cover email and the LoI template:
JVTP = formal applicant (South Bohemian region requirement), Make More
= lead content/implementation partner. Both docs updated accordingly.

Co-Authored-By: Claude Sonnet 4.6 <noreply@anthropic.com>
</commit_message>
<xml_diff>
--- a/komunikace/LoI-Grand-Garage-draft.docx
+++ b/komunikace/LoI-Grand-Garage-draft.docx
@@ -117,7 +117,7 @@
               <w:rPr>
                 <w:sz w:val="20"/>
               </w:rPr>
-              <w:t>Make More s.r.o.</w:t>
+              <w:t>JVTP — Jihočeský vědeckotechnologický park</w:t>
             </w:r>
           </w:p>
         </w:tc>
@@ -185,7 +185,7 @@
               <w:rPr>
                 <w:sz w:val="20"/>
               </w:rPr>
-              <w:t>[DOPLNIT — adresa provozovny Make More v ČB]</w:t>
+              <w:t>[DOPLNIT — adresa JVTP v ČB]</w:t>
             </w:r>
           </w:p>
         </w:tc>
@@ -255,7 +255,7 @@
               <w:rPr>
                 <w:sz w:val="20"/>
               </w:rPr>
-              <w:t>[DOPLNIT — IČO Make More s.r.o.]</w:t>
+              <w:t>[DOPLNIT — IČO JVTP]</w:t>
             </w:r>
           </w:p>
         </w:tc>
@@ -323,7 +323,7 @@
               <w:rPr>
                 <w:sz w:val="20"/>
               </w:rPr>
-              <w:t>[DOPLNIT — Ondřej Kašpárek]</w:t>
+              <w:t>[DOPLNIT — Jana Moravcová / JVTP]</w:t>
             </w:r>
           </w:p>
         </w:tc>
@@ -391,7 +391,7 @@
               <w:rPr>
                 <w:sz w:val="20"/>
               </w:rPr>
-              <w:t>ondrej@makemore.cz</w:t>
+              <w:t>[DOPLNIT — Jana Moravcová / JVTP]</w:t>
             </w:r>
           </w:p>
         </w:tc>
@@ -440,6 +440,19 @@
           <w:sz w:val="21"/>
         </w:rPr>
         <w:t>The applicant and partner declare that they have a common interest in preparing, organising and implementing a cultural programme as part of the European Capital of Culture 2028 in České Budějovice.</w:t>
+      </w:r>
+    </w:p>
+    <w:p>
+      <w:pPr>
+        <w:spacing w:after="200"/>
+      </w:pPr>
+      <w:r>
+        <w:rPr>
+          <w:i/>
+          <w:color w:val="666666"/>
+          <w:sz w:val="21"/>
+        </w:rPr>
+        <w:t>Note on project structure: The formal grant applicant is JVTP — Jihočeský vědeckotechnologický park (South Bohemian Science and Technology Park), a public research and innovation institution based in České Budějovice. The grant programme requires the applicant to be a legal entity registered in the South Bohemian region. Make More s.r.o. acts as the lead content and implementation partner, co-designing and driving the educational programme, community model, and day-to-day operations of the makerspace. The project is a joint endeavour of both organisations.</w:t>
       </w:r>
     </w:p>
     <w:p>
@@ -608,7 +621,9 @@
               <w:rPr>
                 <w:sz w:val="18"/>
               </w:rPr>
-              <w:t>Ondřej Kašpárek, Make More s.r.o.</w:t>
+              <w:t>[Name, Title]</w:t>
+              <w:br/>
+              <w:t>JVTP — Jihočeský vědeckotechnologický park</w:t>
             </w:r>
           </w:p>
         </w:tc>

</xml_diff>